<commit_message>
Completar Acta de Constitución de NewBit y exportarla a PDF
- Visión y alcance redactados como proyecto propio de NewBit; se
  mantiene la cita del dataset (licencia CC BY 4.0).
- Decisiones del equipo aplicadas: 2 conductas, fechas 05/10-18/12,
  tarifas diferenciadas (total S/ 20,768) y SIDERPERU como caso
  académico. Sin pendientes.
- PDF para entregar junto al .docx; corregidos el ancho de los títulos
  de tabla y la columna Fecha.

Co-Authored-By: Claude Opus 5.5 <noreply@anthropic.com>
</commit_message>
<xml_diff>
--- a/proyecto/entregables/FGAP010_Acta_Constitucion_NewBit/FGAP010_Acta_Constitucion_NewBit.docx
+++ b/proyecto/entregables/FGAP010_Acta_Constitucion_NewBit/FGAP010_Acta_Constitucion_NewBit.docx
@@ -52,18 +52,18 @@
       </w:tblPr>
       <w:tblGrid>
         <w:gridCol w:w="1035"/>
-        <w:gridCol w:w="2775"/>
+        <w:gridCol w:w="2475"/>
         <w:gridCol w:w="1665"/>
         <w:gridCol w:w="2025"/>
-        <w:gridCol w:w="1320"/>
+        <w:gridCol w:w="1620"/>
         <w:gridCol w:w="1695"/>
         <w:tblGridChange w:id="0">
           <w:tblGrid>
             <w:gridCol w:w="1035"/>
-            <w:gridCol w:w="2775"/>
+            <w:gridCol w:w="2475"/>
             <w:gridCol w:w="1665"/>
             <w:gridCol w:w="2025"/>
-            <w:gridCol w:w="1320"/>
+            <w:gridCol w:w="1620"/>
             <w:gridCol w:w="1695"/>
           </w:tblGrid>
         </w:tblGridChange>
@@ -447,18 +447,7 @@
                 <w:szCs w:val="20"/>
                 <w:rtl w:val="0"/>
               </w:rPr>
-              <w:t xml:space="preserve">Sponsor </w:t>
-            </w:r>
-            <w:r>
-              <w:rPr>
-                <w:highlight w:val="yellow"/>
-                <w:b w:val="0"/>
-                <w:bCs w:val="0"/>
-                <w:sz w:val="20"/>
-                <w:szCs w:val="20"/>
-                <w:rtl w:val="0"/>
-              </w:rPr>
-              <w:t>propuesto</w:t>
+              <w:t>Sponsor</w:t>
             </w:r>
           </w:p>
         </w:tc>
@@ -714,7 +703,7 @@
               <w:rPr>
                 <w:rtl w:val="0"/>
               </w:rPr>
-              <w:t>NewBit es una plataforma de Computer Vision que convierte cámaras existentes en sensores inteligentes configurables para operaciones industriales. Las inspecciones de seguridad no cubren todo el turno y las cámaras de vigilancia graban, pero no avisan cuando ocurre una conducta insegura.</w:t>
+              <w:t>NewBit es una plataforma de Computer Vision que convierte las cámaras que una planta ya tiene en sensores inteligentes configurables. En lugar de grabar video que nadie revisa a tiempo, NewBit entiende lo que ocurre frente a la cámara y lo convierte en eventos operativos claros, oportunos y accionables.</w:t>
             </w:r>
           </w:p>
           <w:p>
@@ -726,7 +715,7 @@
               <w:rPr>
                 <w:rtl w:val="0"/>
               </w:rPr>
-              <w:t>Como primera capacidad, NewBit detectará conductas inseguras en video. Para ello replica, a pequeña escala y de forma trazable, la investigación Unsafe-Net (Önal y Dandıl, 2024): YOLOv4 detecta personas y objetos y descarta los frames sin interés, y un modelo ConvLSTM analiza la secuencia restante para clasificar la conducta.</w:t>
+              <w:t>Su primera capacidad es la detección automática de conductas inseguras. La mayoría de los accidentes laborales nace de una acción, no de un objeto: alguien que sale de la vía peatonal o un panel eléctrico que queda abierto. Por eso NewBit no analiza fotos aisladas: combina detección de objetos (YOLOv4) con un modelo espacio-temporal (ConvLSTM) que observa la secuencia completa, reconoce la conducta y emite una alerta visual y sonora en segundos.</w:t>
             </w:r>
           </w:p>
           <w:p>
@@ -738,7 +727,7 @@
               <w:rPr>
                 <w:rtl w:val="0"/>
               </w:rPr>
-              <w:t>El resultado se muestra en una interfaz con registro y alerta para que un supervisor de Seguridad y Salud en el Trabajo (SST) valide y decida. Es un prototipo académico de apoyo: no reemplaza la supervisión humana ni el sistema de gestión de SST.</w:t>
+              <w:t>Así, el supervisor de Seguridad y Salud en el Trabajo (SST) deja de depender de inspecciones esporádicas y pasa a contar con una vigilancia continua que le avisa en el momento en que puede intervenir. NewBit apoya la decisión humana, no la reemplaza, y respeta la privacidad: no identifica personas ni usa reconocimiento facial.</w:t>
             </w:r>
           </w:p>
         </w:tc>
@@ -919,7 +908,7 @@
               <w:rPr>
                 <w:rtl w:val="0"/>
               </w:rPr>
-              <w:t>- RF-07: mostrar una alerta visual (y sonora simulada) cuando se detecte una conducta insegura.</w:t>
+              <w:t>- RF-07: mostrar una alerta visual y sonora cuando se detecte una conducta insegura.</w:t>
             </w:r>
           </w:p>
           <w:p>
@@ -993,7 +982,7 @@
               <w:rPr>
                 <w:rtl w:val="0"/>
               </w:rPr>
-              <w:t>- Sin reconocimiento facial ni identificación de personas.</w:t>
+              <w:t>- Privacidad por diseño: sin reconocimiento facial ni identificación de personas.</w:t>
             </w:r>
           </w:p>
         </w:tc>
@@ -1101,7 +1090,7 @@
               <w:rPr>
                 <w:rtl w:val="0"/>
               </w:rPr>
-              <w:t>El proyecto comprende el análisis de la investigación base (Unsafe-Net) y de su dataset, la construcción del primer módulo de NewBit como réplica pequeña y fiel de esa investigación, y su evaluación comparativa.</w:t>
+              <w:t>El proyecto comprende el diseño, la construcción y la evaluación de la primera versión de NewBit: un pipeline completo que recibe video industrial, filtra los frames relevantes, reconoce la conducta y la comunica en una interfaz con registro y alerta.</w:t>
             </w:r>
           </w:p>
           <w:p>
@@ -1127,14 +1116,7 @@
               <w:rPr>
                 <w:rtl w:val="0"/>
               </w:rPr>
-              <w:t xml:space="preserve">- Conductas: Safe Walkway Violation (caminar fuera de la vía peatonal) y Opened Panel Cover (panel abierto), con sus clases seguras de contraste; ampliable a las cuatro conductas inseguras si el tiempo lo permite. </w:t>
-            </w:r>
-            <w:r>
-              <w:rPr>
-                <w:highlight w:val="yellow"/>
-                <w:rtl w:val="0"/>
-              </w:rPr>
-              <w:t>POR CONFIRMAR</w:t>
+              <w:t>- Conductas de la primera versión: tránsito fuera de la vía peatonal (Safe Walkway Violation) y panel eléctrico abierto (Opened Panel Cover), con sus casos seguros de contraste. La arquitectura queda preparada para incorporar nuevas conductas.</w:t>
             </w:r>
           </w:p>
           <w:p>
@@ -1146,7 +1128,7 @@
               <w:rPr>
                 <w:rtl w:val="0"/>
               </w:rPr>
-              <w:t>- Datos: Video Dataset for Safe and Unsafe Behaviours (Mendeley Data, DOI 10.17632/xjmtb22pff.1, CC BY 4.0), con su división oficial de entrenamiento y prueba.</w:t>
+              <w:t>- Datos: Video Dataset for Safe and Unsafe Behaviours (Önal y Dandıl, 2024; Mendeley Data, DOI 10.17632/xjmtb22pff.1, licencia CC BY 4.0), grabado en una planta industrial real, con su división oficial de entrenamiento y prueba.</w:t>
             </w:r>
           </w:p>
           <w:p>
@@ -1158,7 +1140,7 @@
               <w:rPr>
                 <w:rtl w:val="0"/>
               </w:rPr>
-              <w:t>- Comparación: ConvLSTM aplicado directamente a los clips (línea base) frente a YOLOv4 + ConvLSTM (Unsafe-Net reducido).</w:t>
+              <w:t>- Evaluación: comparación entre la clasificación temporal directa y el pipeline completo de NewBit (YOLOv4 + ConvLSTM), en precisión y tiempo de procesamiento.</w:t>
             </w:r>
           </w:p>
           <w:p>
@@ -1172,7 +1154,7 @@
                 <w:bCs/>
                 <w:rtl w:val="0"/>
               </w:rPr>
-              <w:t>Límites (fuera del alcance)</w:t>
+              <w:t>Límites (fuera del alcance de esta versión)</w:t>
             </w:r>
           </w:p>
           <w:p>
@@ -1184,7 +1166,7 @@
               <w:rPr>
                 <w:rtl w:val="0"/>
               </w:rPr>
-              <w:t>- Instalación en una planta real, cámaras en vivo y hardware de alerta físico.</w:t>
+              <w:t>- Instalación en la planta, conexión a cámaras en vivo y dispositivos de alerta físicos.</w:t>
             </w:r>
           </w:p>
           <w:p>
@@ -1208,7 +1190,7 @@
               <w:rPr>
                 <w:rtl w:val="0"/>
               </w:rPr>
-              <w:t>- Certificación o validación oficial de SST; no se afirmará reducción de accidentes.</w:t>
+              <w:t>- Certificación oficial de SST; no se afirmará reducción de accidentes sin evidencia.</w:t>
             </w:r>
           </w:p>
           <w:p>
@@ -1218,9 +1200,11 @@
             </w:pPr>
             <w:r>
               <w:rPr>
-                <w:rtl w:val="0"/>
-              </w:rPr>
-              <w:t>- Alcanzar el 95.81 % del artículo: es una referencia, no una meta.</w:t>
+                <w:b/>
+                <w:bCs/>
+                <w:rtl w:val="0"/>
+              </w:rPr>
+              <w:t>Entregables clave</w:t>
             </w:r>
           </w:p>
           <w:p>
@@ -1230,11 +1214,9 @@
             </w:pPr>
             <w:r>
               <w:rPr>
-                <w:b/>
-                <w:bCs/>
-                <w:rtl w:val="0"/>
-              </w:rPr>
-              <w:t>Entregables clave</w:t>
+                <w:rtl w:val="0"/>
+              </w:rPr>
+              <w:t>- Documentos de gestión: Acta, Registro de Stakeholders, Roles y Prototipos, Épicas, Backlog priorizado, Criterios de Terminado y Cierre.</w:t>
             </w:r>
           </w:p>
           <w:p>
@@ -1246,7 +1228,7 @@
               <w:rPr>
                 <w:rtl w:val="0"/>
               </w:rPr>
-              <w:t>- Documentos de gestión: Acta, Registro de Stakeholders, Roles y Prototipos, Épicas, Backlog priorizado, Criterios de Terminado y Cierre.</w:t>
+              <w:t>- Conjunto de frames anotados y modelo YOLOv4 entrenado.</w:t>
             </w:r>
           </w:p>
           <w:p>
@@ -1258,7 +1240,7 @@
               <w:rPr>
                 <w:rtl w:val="0"/>
               </w:rPr>
-              <w:t>- Subconjunto de frames anotados y modelo YOLOv4 entrenado.</w:t>
+              <w:t>- Modelo ConvLSTM entrenado y evaluado, con métricas por clase.</w:t>
             </w:r>
           </w:p>
           <w:p>
@@ -1270,7 +1252,7 @@
               <w:rPr>
                 <w:rtl w:val="0"/>
               </w:rPr>
-              <w:t>- Modelo ConvLSTM (línea base y con filtrado) con métricas por clase.</w:t>
+              <w:t>- Plataforma NewBit con interfaz, registro de detecciones y alerta.</w:t>
             </w:r>
           </w:p>
           <w:p>
@@ -1282,19 +1264,7 @@
               <w:rPr>
                 <w:rtl w:val="0"/>
               </w:rPr>
-              <w:t>- Prototipo con interfaz, registro de detecciones y alerta simulada.</w:t>
-            </w:r>
-          </w:p>
-          <w:p>
-            <w:pPr>
-              <w:spacing w:after="80" w:lineRule="auto"/>
-              <w:rPr/>
-            </w:pPr>
-            <w:r>
-              <w:rPr>
-                <w:rtl w:val="0"/>
-              </w:rPr>
-              <w:t>- Informe técnico con resultados, diferencias con el artículo y decisiones no documentadas por los autores.</w:t>
+              <w:t>- Informe técnico con resultados, métricas y decisiones de diseño.</w:t>
             </w:r>
           </w:p>
         </w:tc>
@@ -1389,7 +1359,7 @@
               <w:rPr>
                 <w:rtl w:val="0"/>
               </w:rPr>
-              <w:t>- Parámetros incompletos en el artículo (ConvLSTM, selección de frames): cada valor propio se documentará como decisión de la réplica.</w:t>
+              <w:t>- Ajuste del modelo temporal (longitud de secuencia, capas, hiperparámetros): experimentación controlada y registro de cada configuración.</w:t>
             </w:r>
           </w:p>
           <w:p>
@@ -1401,7 +1371,7 @@
               <w:rPr>
                 <w:rtl w:val="0"/>
               </w:rPr>
-              <w:t>- No hay código oficial: se implementará con bibliotecas abiertas y se registrarán las diferencias.</w:t>
+              <w:t>- Implementación propia del pipeline completo: uso de bibliotecas abiertas y probadas, y revisión por pares del código.</w:t>
             </w:r>
           </w:p>
           <w:p>
@@ -1413,7 +1383,7 @@
               <w:rPr>
                 <w:rtl w:val="0"/>
               </w:rPr>
-              <w:t>- GPU y tiempo de entrenamiento limitados: trabajar con un subconjunto de clases y usar Colab o GPU local, con una bolsa de cómputo en la nube.</w:t>
+              <w:t>- GPU y tiempo de entrenamiento limitados: priorizar las conductas de la primera versión y usar Colab o GPU local, con una bolsa de cómputo en la nube.</w:t>
             </w:r>
           </w:p>
           <w:p>
@@ -1425,7 +1395,7 @@
               <w:rPr>
                 <w:rtl w:val="0"/>
               </w:rPr>
-              <w:t>- Etiquetado de frames más lento de lo previsto: limitar la muestra y priorizar las clases elegidas.</w:t>
+              <w:t>- Etiquetado de frames más lento de lo previsto: muestreo representativo y priorización de las clases elegidas.</w:t>
             </w:r>
           </w:p>
           <w:p>
@@ -1437,7 +1407,7 @@
               <w:rPr>
                 <w:rtl w:val="0"/>
               </w:rPr>
-              <w:t>- Espacio en disco (30–50 GB entre videos, frames y checkpoints): usar almacenamiento externo o en la nube.</w:t>
+              <w:t>- Espacio en disco (30–50 GB entre videos, frames y checkpoints): almacenamiento externo o en la nube.</w:t>
             </w:r>
           </w:p>
           <w:p>
@@ -1449,7 +1419,7 @@
               <w:rPr>
                 <w:rtl w:val="0"/>
               </w:rPr>
-              <w:t>- Cambio de dominio: el dataset proviene de una sola fábrica y dos cámaras; los resultados no se generalizan a otras plantas.</w:t>
+              <w:t>- Cambio de entorno: los datos provienen de una planta y dos cámaras; la adaptación a otras plantas se planifica como evolución.</w:t>
             </w:r>
           </w:p>
           <w:p>
@@ -1519,6 +1489,7 @@
         </w:trPr>
         <w:tc>
           <w:tcPr>
+            <w:gridSpan w:val="3"/>
             <w:tcBorders>
               <w:top w:color="777777" w:space="0" w:sz="4" w:val="single"/>
               <w:left w:color="777777" w:space="0" w:sz="4" w:val="single"/>
@@ -1679,7 +1650,7 @@
                 <w:szCs w:val="20"/>
                 <w:rtl w:val="0"/>
               </w:rPr>
-              <w:t>Pivote, acta y formatos de gestión iniciales</w:t>
+              <w:t>Inicio del proyecto, acta y formatos de gestión iniciales</w:t>
             </w:r>
           </w:p>
         </w:tc>
@@ -1763,7 +1734,7 @@
                 <w:szCs w:val="20"/>
                 <w:rtl w:val="0"/>
               </w:rPr>
-              <w:t>Sprint 1: dataset, subconjunto de clases, entorno de trabajo y anotación de frames</w:t>
+              <w:t>Sprint 1: dataset, conductas de la primera versión, entorno de trabajo y anotación de frames</w:t>
             </w:r>
           </w:p>
         </w:tc>
@@ -1931,7 +1902,7 @@
                 <w:szCs w:val="20"/>
                 <w:rtl w:val="0"/>
               </w:rPr>
-              <w:t>Sprint 3: línea base ConvLSTM, Unsafe-Net reducido (YOLOv4 + ConvLSTM) y comparación</w:t>
+              <w:t>Sprint 3: modelo ConvLSTM, pipeline completo YOLOv4 + ConvLSTM y evaluación comparativa</w:t>
             </w:r>
           </w:p>
         </w:tc>
@@ -2015,7 +1986,7 @@
                 <w:szCs w:val="20"/>
                 <w:rtl w:val="0"/>
               </w:rPr>
-              <w:t>Sprint 4: interfaz, registro, alerta simulada, pruebas e informe técnico</w:t>
+              <w:t>Sprint 4: interfaz, registro, alerta, pruebas integradas e informe técnico</w:t>
             </w:r>
           </w:p>
         </w:tc>
@@ -2167,16 +2138,7 @@
           <w:bCs w:val="0"/>
           <w:rtl w:val="0"/>
         </w:rPr>
-        <w:t xml:space="preserve">Duración: 11 semanas calendario (05/10/2026 – 18/12/2026), con 4 sprints de dos semanas. </w:t>
-      </w:r>
-      <w:r>
-        <w:rPr>
-          <w:highlight w:val="yellow"/>
-          <w:b w:val="0"/>
-          <w:bCs w:val="0"/>
-          <w:rtl w:val="0"/>
-        </w:rPr>
-        <w:t>POR CONFIRMAR: fechas según el calendario del semestre 2026-II.</w:t>
+        <w:t>Duración: 11 semanas calendario (05/10/2026 – 18/12/2026), con 4 sprints de dos semanas.</w:t>
       </w:r>
     </w:p>
     <w:tbl>
@@ -2207,6 +2169,7 @@
         </w:trPr>
         <w:tc>
           <w:tcPr>
+            <w:gridSpan w:val="3"/>
             <w:tcBorders>
               <w:top w:color="777777" w:space="0" w:sz="4" w:val="single"/>
               <w:left w:color="777777" w:space="0" w:sz="4" w:val="single"/>
@@ -2393,7 +2356,7 @@
                 <w:szCs w:val="20"/>
                 <w:rtl w:val="0"/>
               </w:rPr>
-              <w:t>100 h × S/ 35</w:t>
+              <w:t>100 h × S/ 40</w:t>
             </w:r>
           </w:p>
         </w:tc>
@@ -2419,7 +2382,7 @@
                 <w:szCs w:val="20"/>
                 <w:rtl w:val="0"/>
               </w:rPr>
-              <w:t>3,500.00</w:t>
+              <w:t>4,000.00</w:t>
             </w:r>
           </w:p>
         </w:tc>
@@ -2477,7 +2440,7 @@
                 <w:szCs w:val="20"/>
                 <w:rtl w:val="0"/>
               </w:rPr>
-              <w:t>200 h × S/ 35</w:t>
+              <w:t>200 h × S/ 38</w:t>
             </w:r>
           </w:p>
         </w:tc>
@@ -2503,7 +2466,7 @@
                 <w:szCs w:val="20"/>
                 <w:rtl w:val="0"/>
               </w:rPr>
-              <w:t>7,000.00</w:t>
+              <w:t>7,600.00</w:t>
             </w:r>
           </w:p>
         </w:tc>
@@ -3081,7 +3044,7 @@
                 <w:szCs w:val="20"/>
                 <w:rtl w:val="0"/>
               </w:rPr>
-              <w:t>17,780.00</w:t>
+              <w:t>18,880.00</w:t>
             </w:r>
           </w:p>
         </w:tc>
@@ -3165,7 +3128,7 @@
                 <w:szCs w:val="20"/>
                 <w:rtl w:val="0"/>
               </w:rPr>
-              <w:t>1,778.00</w:t>
+              <w:t>1,888.00</w:t>
             </w:r>
           </w:p>
         </w:tc>
@@ -3239,7 +3202,7 @@
                 <w:szCs w:val="20"/>
                 <w:rtl w:val="0"/>
               </w:rPr>
-              <w:t>19,558.00</w:t>
+              <w:t>20,768.00</w:t>
             </w:r>
           </w:p>
         </w:tc>
@@ -3255,16 +3218,7 @@
           <w:bCs w:val="0"/>
           <w:rtl w:val="0"/>
         </w:rPr>
-        <w:t xml:space="preserve">Presupuesto estimado del proyecto: S/ 19,558. Incluye S/ 17,500 de dedicación valorizada de los tres integrantes; el gasto en efectivo previsto es de S/ 280 más la contingencia. </w:t>
-      </w:r>
-      <w:r>
-        <w:rPr>
-          <w:highlight w:val="yellow"/>
-          <w:b w:val="0"/>
-          <w:bCs w:val="0"/>
-          <w:rtl w:val="0"/>
-        </w:rPr>
-        <w:t>POR CONFIRMAR: tarifas y precios referenciales.</w:t>
+        <w:t>Presupuesto estimado del proyecto: S/ 20,768. Incluye S/ 18,600 de dedicación valorizada de los tres integrantes; el gasto en efectivo previsto es de S/ 280 más la contingencia.</w:t>
       </w:r>
     </w:p>
     <w:p>
@@ -3319,6 +3273,7 @@
         </w:trPr>
         <w:tc>
           <w:tcPr>
+            <w:gridSpan w:val="2"/>
             <w:tcBorders>
               <w:top w:color="777777" w:space="0" w:sz="4" w:val="single"/>
               <w:left w:color="777777" w:space="0" w:sz="4" w:val="single"/>
@@ -3589,7 +3544,7 @@
                 <w:szCs w:val="20"/>
                 <w:rtl w:val="0"/>
               </w:rPr>
-              <w:t>Developer. Prepara los datos y entrena y evalúa YOLOv4 y ConvLSTM.</w:t>
+              <w:t>Developer. Prepara los datos y entrena y evalúa los modelos YOLOv4 y ConvLSTM.</w:t>
             </w:r>
           </w:p>
         </w:tc>
@@ -3647,7 +3602,7 @@
                 <w:szCs w:val="20"/>
                 <w:rtl w:val="0"/>
               </w:rPr>
-              <w:t>Sponsor propuesto; gerente de operaciones de la organización del caso. Autoriza el proyecto y resuelve recursos.</w:t>
+              <w:t>Sponsor; gerente de operaciones de SIDERPERU. Autoriza el proyecto y resuelve recursos.</w:t>
             </w:r>
           </w:p>
         </w:tc>
@@ -3705,7 +3660,7 @@
                 <w:szCs w:val="20"/>
                 <w:rtl w:val="0"/>
               </w:rPr>
-              <w:t>Representante propuesta de SST. Define qué conductas importan y valida la utilidad de las alertas.</w:t>
+              <w:t>Representante de SST. Define qué conductas importan y valida la utilidad de las alertas.</w:t>
             </w:r>
           </w:p>
         </w:tc>
@@ -3763,7 +3718,7 @@
                 <w:szCs w:val="20"/>
                 <w:rtl w:val="0"/>
               </w:rPr>
-              <w:t>Representante propuesto de TI. Revisa infraestructura, almacenamiento y seguridad de la información.</w:t>
+              <w:t>Representante de TI. Revisa infraestructura, almacenamiento y seguridad de la información.</w:t>
             </w:r>
           </w:p>
         </w:tc>
@@ -3895,24 +3850,7 @@
           <w:bCs w:val="0"/>
           <w:rtl w:val="0"/>
         </w:rPr>
-        <w:t xml:space="preserve">El equipo Scrum está formado por tres estudiantes del curso. Los representantes institucionales (Sponsor, SST, TI) y sus cargos son ficticios para este caso académico. Organización del caso: SIDERPERU (propuesta). </w:t>
-      </w:r>
-      <w:r>
-        <w:rPr>
-          <w:highlight w:val="yellow"/>
-          <w:b w:val="0"/>
-          <w:bCs w:val="0"/>
-          <w:rtl w:val="0"/>
-        </w:rPr>
-        <w:t>POR CONFIRMAR: organización del caso.</w:t>
-      </w:r>
-      <w:r>
-        <w:rPr>
-          <w:b w:val="0"/>
-          <w:bCs w:val="0"/>
-          <w:rtl w:val="0"/>
-        </w:rPr>
-        <w:t xml:space="preserve"> El prototipo se entrena con un dataset público de otra planta; no se usará video de la organización.</w:t>
+        <w:t>El equipo Scrum está formado por tres estudiantes del curso. Organización del caso: SIDERPERU (caso académico propuesto). Los representantes institucionales (Sponsor, SST, TI) y sus cargos son ficticios; no expresan un vínculo real con la empresa ni se usará video de sus instalaciones.</w:t>
       </w:r>
     </w:p>
     <w:tbl>
@@ -3993,7 +3931,7 @@
               <w:rPr>
                 <w:rtl w:val="0"/>
               </w:rPr>
-              <w:t>El éxito se acreditará con una demostración del prototipo y el informe técnico, revisados por el Product Owner y el docente. Criterios:</w:t>
+              <w:t>El éxito se acreditará con una demostración de NewBit y el informe técnico, revisados por el Product Owner y el docente. Criterios:</w:t>
             </w:r>
           </w:p>
           <w:p>
@@ -4005,7 +3943,7 @@
               <w:rPr>
                 <w:rtl w:val="0"/>
               </w:rPr>
-              <w:t>- Implementa el pipeline completo: video → YOLOv4 → selección de frames → ConvLSTM → registro y alerta.</w:t>
+              <w:t>- Funciona el pipeline completo: video → YOLOv4 → selección de frames → ConvLSTM → registro y alerta.</w:t>
             </w:r>
           </w:p>
           <w:p>
@@ -4017,7 +3955,7 @@
               <w:rPr>
                 <w:rtl w:val="0"/>
               </w:rPr>
-              <w:t>- Separa la etapa espacial (detección) de la temporal (clasificación).</w:t>
+              <w:t>- Las etapas espacial (detección) y temporal (clasificación) están separadas y se pueden evaluar por separado.</w:t>
             </w:r>
           </w:p>
           <w:p>
@@ -4029,7 +3967,7 @@
               <w:rPr>
                 <w:rtl w:val="0"/>
               </w:rPr>
-              <w:t>- Demuestra con datos la reducción de frames por secuencia.</w:t>
+              <w:t>- Se demuestra con datos la reducción de frames por secuencia y su efecto en el tiempo de procesamiento.</w:t>
             </w:r>
           </w:p>
           <w:p>
@@ -4041,7 +3979,7 @@
               <w:rPr>
                 <w:rtl w:val="0"/>
               </w:rPr>
-              <w:t>- Compara la línea base (ConvLSTM directo) con YOLOv4 + ConvLSTM mediante métricas por clase y tiempos.</w:t>
+              <w:t>- La evaluación compara la clasificación temporal directa con el pipeline completo mediante métricas por clase y tiempos.</w:t>
             </w:r>
           </w:p>
           <w:p>
@@ -4053,7 +3991,7 @@
               <w:rPr>
                 <w:rtl w:val="0"/>
               </w:rPr>
-              <w:t>- Explica las diferencias con el artículo y documenta las decisiones que los autores no especificaron.</w:t>
+              <w:t>- Las decisiones técnicas y sus resultados quedan documentados.</w:t>
             </w:r>
           </w:p>
           <w:p>
@@ -4077,7 +4015,7 @@
               <w:rPr>
                 <w:rtl w:val="0"/>
               </w:rPr>
-              <w:t>No es requisito alcanzar el 95.81 % reportado por los autores. Aprueban el Product Owner y el Sponsor propuesto, con revisión académica del docente.</w:t>
+              <w:t>Las metas de desempeño se fijarán con la línea base obtenida en el Sprint 3. Aprueban el Product Owner y el Sponsor, con revisión académica del docente.</w:t>
             </w:r>
           </w:p>
         </w:tc>
@@ -4184,7 +4122,7 @@
               <w:rPr>
                 <w:rtl w:val="0"/>
               </w:rPr>
-              <w:t>- Cierre con alcance reducido: si el cómputo o el tiempo resultan insuficientes, se cierra con una sola conducta y la línea base, con el análisis documentado.</w:t>
+              <w:t>- Cierre con alcance reducido: si el cómputo o el tiempo resultan insuficientes, se cierra con una conducta y su evaluación documentada.</w:t>
             </w:r>
           </w:p>
           <w:p>
@@ -4254,6 +4192,7 @@
         </w:trPr>
         <w:tc>
           <w:tcPr>
+            <w:gridSpan w:val="3"/>
             <w:tcBorders>
               <w:top w:color="777777" w:space="0" w:sz="4" w:val="single"/>
               <w:left w:color="777777" w:space="0" w:sz="4" w:val="single"/>
@@ -4456,7 +4395,7 @@
                 <w:szCs w:val="20"/>
                 <w:rtl w:val="0"/>
               </w:rPr>
-              <w:t>Sponsor propuesto</w:t>
+              <w:t>Sponsor</w:t>
             </w:r>
           </w:p>
         </w:tc>
@@ -4531,6 +4470,7 @@
         </w:trPr>
         <w:tc>
           <w:tcPr>
+            <w:gridSpan w:val="4"/>
             <w:tcBorders>
               <w:top w:color="777777" w:space="0" w:sz="4" w:val="single"/>
               <w:left w:color="777777" w:space="0" w:sz="4" w:val="single"/>
@@ -4749,7 +4689,7 @@
                 <w:szCs w:val="20"/>
                 <w:rtl w:val="0"/>
               </w:rPr>
-              <w:t>SIDERPERU (caso propuesto)</w:t>
+              <w:t>SIDERPERU (caso académico)</w:t>
             </w:r>
           </w:p>
         </w:tc>
@@ -4817,7 +4757,7 @@
           <w:bCs w:val="0"/>
           <w:rtl w:val="0"/>
         </w:rPr>
-        <w:t>Estado de autorización: propuesta académica para revisión del equipo y del docente. Los nombres institucionales son ficticios y no expresan un vínculo real con la organización.</w:t>
+        <w:t>Estado de autorización: propuesta académica para revisión del docente. Los nombres institucionales son ficticios y no expresan un vínculo real con la organización.</w:t>
       </w:r>
     </w:p>
     <w:sectPr>

</xml_diff>